<commit_message>
Add stock price lookup to chat client
Adds a broadcast-only `stock <ticker>` command that retrieves current prices from Yahoo Finance, validates and formats the result, and handles request and response errors. Documents setup and client commands in a new README and updates the architecture document.
</commit_message>
<xml_diff>
--- a/ChatApplication-Architecture.docx
+++ b/ChatApplication-Architecture.docx
@@ -359,6 +359,20 @@
         </w:rPr>
         <w:t>└── Client/</w:t>
       </w:r>
+    </w:p>
+    <w:p>
+      <w:pPr>
+        <w:ind w:firstLine="360"/>
+        <w:rPr>
+          <w:lang w:val="en-US"/>
+        </w:rPr>
+      </w:pPr>
+      <w:r>
+        <w:rPr>
+          <w:lang w:val="en-US"/>
+        </w:rPr>
+        <w:t xml:space="preserve">├── </w:t>
+      </w:r>
       <w:proofErr w:type="spellStart"/>
       <w:r>
         <w:rPr>
@@ -372,6 +386,47 @@
           <w:lang w:val="en-US"/>
         </w:rPr>
         <w:t xml:space="preserve">            Interactive TCP client and receive loop</w:t>
+      </w:r>
+    </w:p>
+    <w:p>
+      <w:pPr>
+        <w:ind w:firstLine="360"/>
+        <w:rPr>
+          <w:lang w:val="en-US"/>
+        </w:rPr>
+      </w:pPr>
+      <w:r>
+        <w:rPr>
+          <w:lang w:val="en-US"/>
+        </w:rPr>
+        <w:t xml:space="preserve"> </w:t>
+      </w:r>
+      <w:r>
+        <w:rPr>
+          <w:lang w:val="en-US"/>
+        </w:rPr>
+        <w:t>└──</w:t>
+      </w:r>
+      <w:r>
+        <w:rPr>
+          <w:lang w:val="en-US"/>
+        </w:rPr>
+        <w:t xml:space="preserve"> </w:t>
+      </w:r>
+      <w:proofErr w:type="spellStart"/>
+      <w:r>
+        <w:rPr>
+          <w:lang w:val="en-US"/>
+        </w:rPr>
+        <w:t>StockPriceClient.cs</w:t>
+      </w:r>
+      <w:proofErr w:type="spellEnd"/>
+      <w:r>
+        <w:rPr>
+          <w:lang w:val="en-US"/>
+        </w:rPr>
+        <w:tab/>
+        <w:t>API call for enquiring about a stock’s price</w:t>
       </w:r>
     </w:p>
     <w:p>
@@ -409,21 +464,7 @@
         <w:rPr>
           <w:lang w:val="en-US"/>
         </w:rPr>
-        <w:t>The server owns the TCP listener and keeps connected users in a thread-</w:t>
-      </w:r>
-      <w:proofErr w:type="gramStart"/>
-      <w:r>
-        <w:rPr>
-          <w:lang w:val="en-US"/>
-        </w:rPr>
-        <w:t>safe session</w:t>
-      </w:r>
-      <w:proofErr w:type="gramEnd"/>
-      <w:r>
-        <w:rPr>
-          <w:lang w:val="en-US"/>
-        </w:rPr>
-        <w:t xml:space="preserve"> dictionary. Each </w:t>
+        <w:t xml:space="preserve">The server owns the TCP listener and keeps connected users in a thread-safe session dictionary. Each </w:t>
       </w:r>
       <w:proofErr w:type="spellStart"/>
       <w:r>
@@ -502,21 +543,8 @@
         <w:rPr>
           <w:lang w:val="en-US"/>
         </w:rPr>
-        <w:t>Both sides use async/</w:t>
-      </w:r>
-      <w:proofErr w:type="gramStart"/>
-      <w:r>
-        <w:rPr>
-          <w:lang w:val="en-US"/>
-        </w:rPr>
-        <w:t>await</w:t>
-      </w:r>
-      <w:proofErr w:type="gramEnd"/>
-      <w:r>
-        <w:rPr>
-          <w:lang w:val="en-US"/>
-        </w:rPr>
-        <w:t xml:space="preserve"> over </w:t>
+        <w:lastRenderedPageBreak/>
+        <w:t xml:space="preserve">Both sides use async/await over </w:t>
       </w:r>
       <w:proofErr w:type="spellStart"/>
       <w:r>
@@ -585,7 +613,6 @@
         <w:rPr>
           <w:lang w:val="en-US"/>
         </w:rPr>
-        <w:lastRenderedPageBreak/>
         <w:t xml:space="preserve">Outgoing writes are serialized by a </w:t>
       </w:r>
       <w:proofErr w:type="spellStart"/>
@@ -643,14 +670,12 @@
         </w:rPr>
         <w:t xml:space="preserve"> records it in channel history and asynchronously sends it only to sessions currently </w:t>
       </w:r>
-      <w:proofErr w:type="gramStart"/>
-      <w:r>
-        <w:rPr>
-          <w:lang w:val="en-US"/>
-        </w:rPr>
-        <w:t>in</w:t>
-      </w:r>
-      <w:proofErr w:type="gramEnd"/>
+      <w:r>
+        <w:rPr>
+          <w:lang w:val="en-US"/>
+        </w:rPr>
+        <w:t>on</w:t>
+      </w:r>
       <w:r>
         <w:rPr>
           <w:lang w:val="en-US"/>
@@ -715,7 +740,6 @@
         <w:t xml:space="preserve"> assigns </w:t>
       </w:r>
       <w:proofErr w:type="spellStart"/>
-      <w:proofErr w:type="gramStart"/>
       <w:r>
         <w:rPr>
           <w:lang w:val="en-US"/>
@@ -723,7 +747,6 @@
         <w:t>server.BroadcastAsync</w:t>
       </w:r>
       <w:proofErr w:type="spellEnd"/>
-      <w:proofErr w:type="gramEnd"/>
       <w:r>
         <w:rPr>
           <w:lang w:val="en-US"/>
@@ -823,7 +846,7 @@
         <w:rPr>
           <w:lang w:val="en-US"/>
         </w:rPr>
-        <w:t>Delegates and events</w:t>
+        <w:t>End-to-end logic</w:t>
       </w:r>
     </w:p>
     <w:p>
@@ -863,7 +886,19 @@
         <w:rPr>
           <w:lang w:val="en-US"/>
         </w:rPr>
-        <w:t>2. Client sends JOIN broadcast, JOIN private &lt;user&gt;, or MESSAGE &lt;text&gt;.</w:t>
+        <w:t>2. Client sends JOIN broadcast, JOIN private &lt;user&gt;, MESSAGE &lt;text&gt;</w:t>
+      </w:r>
+      <w:r>
+        <w:rPr>
+          <w:lang w:val="en-US"/>
+        </w:rPr>
+        <w:t xml:space="preserve"> or MESSAGE stock &lt;ticker&gt;</w:t>
+      </w:r>
+      <w:r>
+        <w:rPr>
+          <w:lang w:val="en-US"/>
+        </w:rPr>
+        <w:t>.</w:t>
       </w:r>
     </w:p>
     <w:p>

</xml_diff>